<commit_message>
Documentación.docx actualizada, he agregado comando git para limpiar dns cuando git push no funciona
</commit_message>
<xml_diff>
--- a/Documentacion.docx
+++ b/Documentacion.docx
@@ -1727,7 +1727,25 @@
           <w:bCs/>
           <w:lang w:val="en-US"/>
         </w:rPr>
-        <w:t>Subir todo a GitHub: git add ., git commit y git push.</w:t>
+        <w:t xml:space="preserve">Subir </w:t>
+      </w:r>
+      <w:proofErr w:type="spellStart"/>
+      <w:r>
+        <w:rPr>
+          <w:b/>
+          <w:bCs/>
+          <w:lang w:val="en-US"/>
+        </w:rPr>
+        <w:t>todo</w:t>
+      </w:r>
+      <w:proofErr w:type="spellEnd"/>
+      <w:r>
+        <w:rPr>
+          <w:b/>
+          <w:bCs/>
+          <w:lang w:val="en-US"/>
+        </w:rPr>
+        <w:t xml:space="preserve"> a GitHub: git add ., git commit y git push.</w:t>
       </w:r>
     </w:p>
     <w:p>
@@ -2121,50 +2139,96 @@
           <w:bCs/>
           <w:lang w:val="en-US"/>
         </w:rPr>
-        <w:t>from app import app, db</w:t>
-      </w:r>
-    </w:p>
-    <w:p>
-      <w:pPr>
-        <w:rPr>
-          <w:b/>
-          <w:bCs/>
-          <w:lang w:val="en-US"/>
-        </w:rPr>
-      </w:pPr>
-    </w:p>
-    <w:p>
-      <w:pPr>
-        <w:rPr>
-          <w:b/>
-          <w:bCs/>
-          <w:lang w:val="en-US"/>
-        </w:rPr>
-      </w:pPr>
-      <w:r>
-        <w:rPr>
-          <w:b/>
-          <w:bCs/>
-          <w:lang w:val="en-US"/>
-        </w:rPr>
-        <w:t>def agregar_columna():</w:t>
-      </w:r>
-    </w:p>
-    <w:p>
-      <w:pPr>
-        <w:rPr>
-          <w:b/>
-          <w:bCs/>
-          <w:lang w:val="en-US"/>
-        </w:rPr>
-      </w:pPr>
-      <w:r>
-        <w:rPr>
-          <w:b/>
-          <w:bCs/>
-          <w:lang w:val="en-US"/>
-        </w:rPr>
-        <w:t xml:space="preserve">    with app.app_context():</w:t>
+        <w:t xml:space="preserve">from app import app, </w:t>
+      </w:r>
+      <w:proofErr w:type="spellStart"/>
+      <w:r>
+        <w:rPr>
+          <w:b/>
+          <w:bCs/>
+          <w:lang w:val="en-US"/>
+        </w:rPr>
+        <w:t>db</w:t>
+      </w:r>
+      <w:proofErr w:type="spellEnd"/>
+    </w:p>
+    <w:p>
+      <w:pPr>
+        <w:rPr>
+          <w:b/>
+          <w:bCs/>
+          <w:lang w:val="en-US"/>
+        </w:rPr>
+      </w:pPr>
+    </w:p>
+    <w:p>
+      <w:pPr>
+        <w:rPr>
+          <w:b/>
+          <w:bCs/>
+          <w:lang w:val="en-US"/>
+        </w:rPr>
+      </w:pPr>
+      <w:r>
+        <w:rPr>
+          <w:b/>
+          <w:bCs/>
+          <w:lang w:val="en-US"/>
+        </w:rPr>
+        <w:t xml:space="preserve">def </w:t>
+      </w:r>
+      <w:proofErr w:type="spellStart"/>
+      <w:r>
+        <w:rPr>
+          <w:b/>
+          <w:bCs/>
+          <w:lang w:val="en-US"/>
+        </w:rPr>
+        <w:t>agregar_columna</w:t>
+      </w:r>
+      <w:proofErr w:type="spellEnd"/>
+      <w:r>
+        <w:rPr>
+          <w:b/>
+          <w:bCs/>
+          <w:lang w:val="en-US"/>
+        </w:rPr>
+        <w:t>():</w:t>
+      </w:r>
+    </w:p>
+    <w:p>
+      <w:pPr>
+        <w:rPr>
+          <w:b/>
+          <w:bCs/>
+          <w:lang w:val="en-US"/>
+        </w:rPr>
+      </w:pPr>
+      <w:r>
+        <w:rPr>
+          <w:b/>
+          <w:bCs/>
+          <w:lang w:val="en-US"/>
+        </w:rPr>
+        <w:t xml:space="preserve">    with </w:t>
+      </w:r>
+      <w:proofErr w:type="spellStart"/>
+      <w:r>
+        <w:rPr>
+          <w:b/>
+          <w:bCs/>
+          <w:lang w:val="en-US"/>
+        </w:rPr>
+        <w:t>app.app_context</w:t>
+      </w:r>
+      <w:proofErr w:type="spellEnd"/>
+      <w:r>
+        <w:rPr>
+          <w:b/>
+          <w:bCs/>
+          <w:lang w:val="en-US"/>
+        </w:rPr>
+        <w:t>():</w:t>
       </w:r>
     </w:p>
     <w:p>
@@ -2237,30 +2301,112 @@
         </w:rPr>
         <w:t xml:space="preserve">        </w:t>
       </w:r>
-      <w:r>
-        <w:rPr>
-          <w:b/>
-          <w:bCs/>
-          <w:lang w:val="en-US"/>
-        </w:rPr>
-        <w:t>db.session.execute(db.text("ALTER TABLE alumno ADD COLUMN telefono VARCHAR(100);"))</w:t>
-      </w:r>
-    </w:p>
-    <w:p>
-      <w:pPr>
-        <w:rPr>
-          <w:b/>
-          <w:bCs/>
-          <w:lang w:val="en-US"/>
-        </w:rPr>
-      </w:pPr>
-      <w:r>
-        <w:rPr>
-          <w:b/>
-          <w:bCs/>
-          <w:lang w:val="en-US"/>
-        </w:rPr>
-        <w:t xml:space="preserve">        db.session.commit()</w:t>
+      <w:proofErr w:type="spellStart"/>
+      <w:r>
+        <w:rPr>
+          <w:b/>
+          <w:bCs/>
+          <w:lang w:val="en-US"/>
+        </w:rPr>
+        <w:t>db.session.execute</w:t>
+      </w:r>
+      <w:proofErr w:type="spellEnd"/>
+      <w:r>
+        <w:rPr>
+          <w:b/>
+          <w:bCs/>
+          <w:lang w:val="en-US"/>
+        </w:rPr>
+        <w:t>(</w:t>
+      </w:r>
+      <w:proofErr w:type="spellStart"/>
+      <w:r>
+        <w:rPr>
+          <w:b/>
+          <w:bCs/>
+          <w:lang w:val="en-US"/>
+        </w:rPr>
+        <w:t>db.text</w:t>
+      </w:r>
+      <w:proofErr w:type="spellEnd"/>
+      <w:r>
+        <w:rPr>
+          <w:b/>
+          <w:bCs/>
+          <w:lang w:val="en-US"/>
+        </w:rPr>
+        <w:t xml:space="preserve">("ALTER TABLE </w:t>
+      </w:r>
+      <w:proofErr w:type="spellStart"/>
+      <w:r>
+        <w:rPr>
+          <w:b/>
+          <w:bCs/>
+          <w:lang w:val="en-US"/>
+        </w:rPr>
+        <w:t>alumno</w:t>
+      </w:r>
+      <w:proofErr w:type="spellEnd"/>
+      <w:r>
+        <w:rPr>
+          <w:b/>
+          <w:bCs/>
+          <w:lang w:val="en-US"/>
+        </w:rPr>
+        <w:t xml:space="preserve"> ADD COLUMN </w:t>
+      </w:r>
+      <w:proofErr w:type="spellStart"/>
+      <w:r>
+        <w:rPr>
+          <w:b/>
+          <w:bCs/>
+          <w:lang w:val="en-US"/>
+        </w:rPr>
+        <w:t>telefono</w:t>
+      </w:r>
+      <w:proofErr w:type="spellEnd"/>
+      <w:r>
+        <w:rPr>
+          <w:b/>
+          <w:bCs/>
+          <w:lang w:val="en-US"/>
+        </w:rPr>
+        <w:t xml:space="preserve"> VARCHAR(100);"))</w:t>
+      </w:r>
+    </w:p>
+    <w:p>
+      <w:pPr>
+        <w:rPr>
+          <w:b/>
+          <w:bCs/>
+          <w:lang w:val="en-US"/>
+        </w:rPr>
+      </w:pPr>
+      <w:r>
+        <w:rPr>
+          <w:b/>
+          <w:bCs/>
+          <w:lang w:val="en-US"/>
+        </w:rPr>
+        <w:t xml:space="preserve">        </w:t>
+      </w:r>
+      <w:proofErr w:type="spellStart"/>
+      <w:r>
+        <w:rPr>
+          <w:b/>
+          <w:bCs/>
+          <w:lang w:val="en-US"/>
+        </w:rPr>
+        <w:t>db.session.commit</w:t>
+      </w:r>
+      <w:proofErr w:type="spellEnd"/>
+      <w:r>
+        <w:rPr>
+          <w:b/>
+          <w:bCs/>
+          <w:lang w:val="en-US"/>
+        </w:rPr>
+        <w:t>()</w:t>
       </w:r>
     </w:p>
     <w:p>
@@ -2611,26 +2757,1081 @@
     </w:p>
     <w:p>
       <w:pPr>
-        <w:rPr>
-          <w:b/>
-          <w:bCs/>
-        </w:rPr>
-      </w:pPr>
-    </w:p>
-    <w:p>
-      <w:pPr>
-        <w:rPr>
-          <w:b/>
-          <w:bCs/>
-        </w:rPr>
-      </w:pPr>
-      <w:r>
-        <w:rPr>
-          <w:b/>
-          <w:bCs/>
-        </w:rPr>
-        <w:t>---------------------------------------------</w:t>
-      </w:r>
+        <w:pBdr>
+          <w:bottom w:val="single" w:sz="6" w:space="1" w:color="auto"/>
+        </w:pBdr>
+        <w:rPr>
+          <w:b/>
+          <w:bCs/>
+        </w:rPr>
+      </w:pPr>
+    </w:p>
+    <w:p>
+      <w:pPr>
+        <w:rPr>
+          <w:b/>
+          <w:bCs/>
+          <w:color w:val="4472C4" w:themeColor="accent1"/>
+        </w:rPr>
+      </w:pPr>
+      <w:r>
+        <w:rPr>
+          <w:b/>
+          <w:bCs/>
+          <w:color w:val="4472C4" w:themeColor="accent1"/>
+        </w:rPr>
+        <w:t xml:space="preserve">Modificación del </w:t>
+      </w:r>
+      <w:proofErr w:type="spellStart"/>
+      <w:r>
+        <w:rPr>
+          <w:b/>
+          <w:bCs/>
+          <w:color w:val="4472C4" w:themeColor="accent1"/>
+        </w:rPr>
+        <w:t>turno_id</w:t>
+      </w:r>
+      <w:proofErr w:type="spellEnd"/>
+    </w:p>
+    <w:p>
+      <w:pPr>
+        <w:rPr>
+          <w:b/>
+          <w:bCs/>
+        </w:rPr>
+      </w:pPr>
+      <w:r>
+        <w:rPr>
+          <w:b/>
+          <w:bCs/>
+        </w:rPr>
+        <w:t>¡Excelente decisión! Separar los turnos por cada día real de cursada mantendrá tu interfaz web impecable, evitará confusiones y les dará a tus alumnos una experiencia de usuario mucho más profesional.</w:t>
+      </w:r>
+    </w:p>
+    <w:p>
+      <w:pPr>
+        <w:rPr>
+          <w:b/>
+          <w:bCs/>
+        </w:rPr>
+      </w:pPr>
+      <w:r>
+        <w:rPr>
+          <w:b/>
+          <w:bCs/>
+        </w:rPr>
+        <w:t>Aquí tienes el procedimiento pautado, claro y ordenado cronológicamente para aplicar este cambio de forma segura en Render y en tu archivo CSV:</w:t>
+      </w:r>
+    </w:p>
+    <w:p>
+      <w:pPr>
+        <w:rPr>
+          <w:b/>
+          <w:bCs/>
+        </w:rPr>
+      </w:pPr>
+      <w:r>
+        <w:rPr>
+          <w:b/>
+          <w:bCs/>
+        </w:rPr>
+        <w:t>Fase 1: Modificar el código local y actualizar GitHub</w:t>
+      </w:r>
+    </w:p>
+    <w:p>
+      <w:pPr>
+        <w:numPr>
+          <w:ilvl w:val="0"/>
+          <w:numId w:val="10"/>
+        </w:numPr>
+        <w:rPr>
+          <w:b/>
+          <w:bCs/>
+        </w:rPr>
+      </w:pPr>
+      <w:r>
+        <w:rPr>
+          <w:b/>
+          <w:bCs/>
+        </w:rPr>
+        <w:lastRenderedPageBreak/>
+        <w:t xml:space="preserve">Actualizar los turnos en crear_datos.py: Abre el archivo crear_datos.py en tu computadora y modifica la lista de </w:t>
+      </w:r>
+      <w:proofErr w:type="spellStart"/>
+      <w:r>
+        <w:rPr>
+          <w:b/>
+          <w:bCs/>
+        </w:rPr>
+        <w:t>turnos_taller</w:t>
+      </w:r>
+      <w:proofErr w:type="spellEnd"/>
+      <w:r>
+        <w:rPr>
+          <w:b/>
+          <w:bCs/>
+        </w:rPr>
+        <w:t xml:space="preserve"> para desglosar la tarde. Asegúrate de que la línea </w:t>
+      </w:r>
+      <w:proofErr w:type="spellStart"/>
+      <w:r>
+        <w:rPr>
+          <w:b/>
+          <w:bCs/>
+        </w:rPr>
+        <w:t>db.drop_all</w:t>
+      </w:r>
+      <w:proofErr w:type="spellEnd"/>
+      <w:r>
+        <w:rPr>
+          <w:b/>
+          <w:bCs/>
+        </w:rPr>
+        <w:t xml:space="preserve">() esté </w:t>
+      </w:r>
+      <w:proofErr w:type="spellStart"/>
+      <w:r>
+        <w:rPr>
+          <w:b/>
+          <w:bCs/>
+        </w:rPr>
+        <w:t>descomentada</w:t>
+      </w:r>
+      <w:proofErr w:type="spellEnd"/>
+      <w:r>
+        <w:rPr>
+          <w:b/>
+          <w:bCs/>
+        </w:rPr>
+        <w:t xml:space="preserve"> para este proceso:</w:t>
+      </w:r>
+    </w:p>
+    <w:p>
+      <w:pPr>
+        <w:pBdr>
+          <w:bottom w:val="single" w:sz="6" w:space="1" w:color="auto"/>
+        </w:pBdr>
+        <w:rPr>
+          <w:b/>
+          <w:bCs/>
+        </w:rPr>
+      </w:pPr>
+    </w:p>
+    <w:p>
+      <w:pPr>
+        <w:rPr>
+          <w:b/>
+          <w:bCs/>
+          <w:color w:val="4472C4" w:themeColor="accent1"/>
+        </w:rPr>
+      </w:pPr>
+      <w:r>
+        <w:rPr>
+          <w:b/>
+          <w:bCs/>
+          <w:color w:val="4472C4" w:themeColor="accent1"/>
+        </w:rPr>
+        <w:t xml:space="preserve">Importante cuando el </w:t>
+      </w:r>
+      <w:proofErr w:type="spellStart"/>
+      <w:r>
+        <w:rPr>
+          <w:b/>
+          <w:bCs/>
+          <w:color w:val="4472C4" w:themeColor="accent1"/>
+        </w:rPr>
+        <w:t>push</w:t>
+      </w:r>
+      <w:proofErr w:type="spellEnd"/>
+      <w:r>
+        <w:rPr>
+          <w:b/>
+          <w:bCs/>
+          <w:color w:val="4472C4" w:themeColor="accent1"/>
+        </w:rPr>
+        <w:t xml:space="preserve"> no funciona se debe limpiar </w:t>
+      </w:r>
+      <w:proofErr w:type="spellStart"/>
+      <w:r>
+        <w:rPr>
+          <w:b/>
+          <w:bCs/>
+          <w:color w:val="4472C4" w:themeColor="accent1"/>
+        </w:rPr>
+        <w:t>dns</w:t>
+      </w:r>
+      <w:proofErr w:type="spellEnd"/>
+      <w:r>
+        <w:rPr>
+          <w:b/>
+          <w:bCs/>
+          <w:color w:val="4472C4" w:themeColor="accent1"/>
+        </w:rPr>
+        <w:t xml:space="preserve"> y conflictos de red:</w:t>
+      </w:r>
+    </w:p>
+    <w:p>
+      <w:pPr>
+        <w:rPr>
+          <w:b/>
+          <w:bCs/>
+        </w:rPr>
+      </w:pPr>
+      <w:r>
+        <w:rPr>
+          <w:b/>
+          <w:bCs/>
+        </w:rPr>
+        <w:t xml:space="preserve">Ese error, </w:t>
+      </w:r>
+      <w:proofErr w:type="spellStart"/>
+      <w:r>
+        <w:rPr>
+          <w:b/>
+          <w:bCs/>
+        </w:rPr>
+        <w:t>Could</w:t>
+      </w:r>
+      <w:proofErr w:type="spellEnd"/>
+      <w:r>
+        <w:rPr>
+          <w:b/>
+          <w:bCs/>
+        </w:rPr>
+        <w:t xml:space="preserve"> </w:t>
+      </w:r>
+      <w:proofErr w:type="spellStart"/>
+      <w:r>
+        <w:rPr>
+          <w:b/>
+          <w:bCs/>
+        </w:rPr>
+        <w:t>not</w:t>
+      </w:r>
+      <w:proofErr w:type="spellEnd"/>
+      <w:r>
+        <w:rPr>
+          <w:b/>
+          <w:bCs/>
+        </w:rPr>
+        <w:t xml:space="preserve"> </w:t>
+      </w:r>
+      <w:proofErr w:type="spellStart"/>
+      <w:r>
+        <w:rPr>
+          <w:b/>
+          <w:bCs/>
+        </w:rPr>
+        <w:t>resolve</w:t>
+      </w:r>
+      <w:proofErr w:type="spellEnd"/>
+      <w:r>
+        <w:rPr>
+          <w:b/>
+          <w:bCs/>
+        </w:rPr>
+        <w:t xml:space="preserve"> host: github.com, significa que tu computadora no está pudiendo "encontrar" a GitHub en internet. Es un problema de conexión a la red o de DNS (el sistema que traduce nombres como github.com en direcciones IP). </w:t>
+      </w:r>
+    </w:p>
+    <w:p>
+      <w:pPr>
+        <w:rPr>
+          <w:b/>
+          <w:bCs/>
+        </w:rPr>
+      </w:pPr>
+      <w:r>
+        <w:rPr>
+          <w:b/>
+          <w:bCs/>
+        </w:rPr>
+        <w:t>GitHub</w:t>
+      </w:r>
+    </w:p>
+    <w:p>
+      <w:pPr>
+        <w:rPr>
+          <w:b/>
+          <w:bCs/>
+        </w:rPr>
+      </w:pPr>
+      <w:r>
+        <w:rPr>
+          <w:b/>
+          <w:bCs/>
+        </w:rPr>
+        <w:t xml:space="preserve">Dado que estás en una escuela técnica (por la ruta eetpn614 asumo que es la E.E.T.P. </w:t>
+      </w:r>
+      <w:proofErr w:type="spellStart"/>
+      <w:r>
+        <w:rPr>
+          <w:b/>
+          <w:bCs/>
+        </w:rPr>
+        <w:t>N°</w:t>
+      </w:r>
+      <w:proofErr w:type="spellEnd"/>
+      <w:r>
+        <w:rPr>
+          <w:b/>
+          <w:bCs/>
+        </w:rPr>
+        <w:t xml:space="preserve"> 614), es muy común que esto suceda por las restricciones de la red escolar.</w:t>
+      </w:r>
+    </w:p>
+    <w:p>
+      <w:pPr>
+        <w:rPr>
+          <w:b/>
+          <w:bCs/>
+        </w:rPr>
+      </w:pPr>
+      <w:r>
+        <w:rPr>
+          <w:b/>
+          <w:bCs/>
+        </w:rPr>
+        <w:t>Aquí tienes los pasos para solucionarlo, de lo más simple a lo más técnico:</w:t>
+      </w:r>
+    </w:p>
+    <w:p>
+      <w:pPr>
+        <w:rPr>
+          <w:b/>
+          <w:bCs/>
+        </w:rPr>
+      </w:pPr>
+      <w:r>
+        <w:rPr>
+          <w:b/>
+          <w:bCs/>
+        </w:rPr>
+        <w:t>1. Comprobación básica de Internet</w:t>
+      </w:r>
+    </w:p>
+    <w:p>
+      <w:pPr>
+        <w:rPr>
+          <w:b/>
+          <w:bCs/>
+        </w:rPr>
+      </w:pPr>
+      <w:r>
+        <w:rPr>
+          <w:b/>
+          <w:bCs/>
+        </w:rPr>
+        <w:t>Asegúrate de que la computadora tenga internet abriendo el navegador y entrando a cualquier página (como Google o el propio GitHub).</w:t>
+      </w:r>
+    </w:p>
+    <w:p>
+      <w:pPr>
+        <w:numPr>
+          <w:ilvl w:val="0"/>
+          <w:numId w:val="11"/>
+        </w:numPr>
+        <w:rPr>
+          <w:b/>
+          <w:bCs/>
+        </w:rPr>
+      </w:pPr>
+      <w:r>
+        <w:rPr>
+          <w:b/>
+          <w:bCs/>
+        </w:rPr>
+        <w:t xml:space="preserve">Si el navegador no carga: El problema es el cable o el </w:t>
+      </w:r>
+      <w:proofErr w:type="spellStart"/>
+      <w:r>
+        <w:rPr>
+          <w:b/>
+          <w:bCs/>
+        </w:rPr>
+        <w:t>Wi</w:t>
+      </w:r>
+      <w:proofErr w:type="spellEnd"/>
+      <w:r>
+        <w:rPr>
+          <w:b/>
+          <w:bCs/>
+        </w:rPr>
+        <w:t>-Fi de la escuela.</w:t>
+      </w:r>
+    </w:p>
+    <w:p>
+      <w:pPr>
+        <w:numPr>
+          <w:ilvl w:val="0"/>
+          <w:numId w:val="11"/>
+        </w:numPr>
+        <w:rPr>
+          <w:b/>
+          <w:bCs/>
+        </w:rPr>
+      </w:pPr>
+      <w:r>
+        <w:rPr>
+          <w:b/>
+          <w:bCs/>
+        </w:rPr>
+        <w:t>Si el navegador SÍ carga pero Git falla: Pasa al punto 2.</w:t>
+      </w:r>
+    </w:p>
+    <w:p>
+      <w:pPr>
+        <w:rPr>
+          <w:b/>
+          <w:bCs/>
+        </w:rPr>
+      </w:pPr>
+      <w:r>
+        <w:rPr>
+          <w:b/>
+          <w:bCs/>
+        </w:rPr>
+        <w:t>2. Limpiar el caché de DNS (Muy efectivo)</w:t>
+      </w:r>
+    </w:p>
+    <w:p>
+      <w:pPr>
+        <w:rPr>
+          <w:b/>
+          <w:bCs/>
+        </w:rPr>
+      </w:pPr>
+      <w:r>
+        <w:rPr>
+          <w:b/>
+          <w:bCs/>
+        </w:rPr>
+        <w:t>A veces el sistema "se marea" con las direcciones guardadas. Ejecuta este comando en la misma terminal donde estás trabajando:</w:t>
+      </w:r>
+    </w:p>
+    <w:p>
+      <w:pPr>
+        <w:rPr>
+          <w:b/>
+          <w:bCs/>
+        </w:rPr>
+      </w:pPr>
+      <w:r>
+        <w:rPr>
+          <w:b/>
+          <w:bCs/>
+        </w:rPr>
+        <w:t>DOS</w:t>
+      </w:r>
+    </w:p>
+    <w:p>
+      <w:pPr>
+        <w:rPr>
+          <w:b/>
+          <w:bCs/>
+        </w:rPr>
+      </w:pPr>
+      <w:proofErr w:type="spellStart"/>
+      <w:r>
+        <w:rPr>
+          <w:b/>
+          <w:bCs/>
+        </w:rPr>
+        <w:t>ipconfig</w:t>
+      </w:r>
+      <w:proofErr w:type="spellEnd"/>
+      <w:r>
+        <w:rPr>
+          <w:b/>
+          <w:bCs/>
+        </w:rPr>
+        <w:t xml:space="preserve"> /</w:t>
+      </w:r>
+      <w:proofErr w:type="spellStart"/>
+      <w:r>
+        <w:rPr>
+          <w:b/>
+          <w:bCs/>
+        </w:rPr>
+        <w:t>flushdns</w:t>
+      </w:r>
+      <w:proofErr w:type="spellEnd"/>
+    </w:p>
+    <w:p>
+      <w:pPr>
+        <w:rPr>
+          <w:b/>
+          <w:bCs/>
+        </w:rPr>
+      </w:pPr>
+      <w:r>
+        <w:rPr>
+          <w:b/>
+          <w:bCs/>
+        </w:rPr>
+        <w:t xml:space="preserve">Luego intenta el </w:t>
+      </w:r>
+      <w:proofErr w:type="spellStart"/>
+      <w:r>
+        <w:rPr>
+          <w:b/>
+          <w:bCs/>
+        </w:rPr>
+        <w:t>git</w:t>
+      </w:r>
+      <w:proofErr w:type="spellEnd"/>
+      <w:r>
+        <w:rPr>
+          <w:b/>
+          <w:bCs/>
+        </w:rPr>
+        <w:t xml:space="preserve"> </w:t>
+      </w:r>
+      <w:proofErr w:type="spellStart"/>
+      <w:r>
+        <w:rPr>
+          <w:b/>
+          <w:bCs/>
+        </w:rPr>
+        <w:t>push</w:t>
+      </w:r>
+      <w:proofErr w:type="spellEnd"/>
+      <w:r>
+        <w:rPr>
+          <w:b/>
+          <w:bCs/>
+        </w:rPr>
+        <w:t xml:space="preserve"> nuevamente.</w:t>
+      </w:r>
+    </w:p>
+    <w:p>
+      <w:pPr>
+        <w:rPr>
+          <w:b/>
+          <w:bCs/>
+        </w:rPr>
+      </w:pPr>
+      <w:r>
+        <w:rPr>
+          <w:b/>
+          <w:bCs/>
+        </w:rPr>
+        <w:t>3. El problema del Firewall/Proxy escolar (Caso muy probable)</w:t>
+      </w:r>
+    </w:p>
+    <w:p>
+      <w:pPr>
+        <w:rPr>
+          <w:b/>
+          <w:bCs/>
+        </w:rPr>
+      </w:pPr>
+      <w:r>
+        <w:rPr>
+          <w:b/>
+          <w:bCs/>
+        </w:rPr>
+        <w:t xml:space="preserve">Las redes de las escuelas suelen tener Firewalls que bloquean las conexiones de programas externos como Git, aunque el navegador funcione. </w:t>
+      </w:r>
+    </w:p>
+    <w:p>
+      <w:pPr>
+        <w:rPr>
+          <w:b/>
+          <w:bCs/>
+        </w:rPr>
+      </w:pPr>
+      <w:proofErr w:type="spellStart"/>
+      <w:r>
+        <w:rPr>
+          <w:b/>
+          <w:bCs/>
+        </w:rPr>
+        <w:t>Fastvue</w:t>
+      </w:r>
+      <w:proofErr w:type="spellEnd"/>
+      <w:r>
+        <w:rPr>
+          <w:b/>
+          <w:bCs/>
+        </w:rPr>
+        <w:t xml:space="preserve"> </w:t>
+      </w:r>
+      <w:proofErr w:type="spellStart"/>
+      <w:r>
+        <w:rPr>
+          <w:b/>
+          <w:bCs/>
+        </w:rPr>
+        <w:t>Reporter</w:t>
+      </w:r>
+      <w:proofErr w:type="spellEnd"/>
+    </w:p>
+    <w:p>
+      <w:pPr>
+        <w:numPr>
+          <w:ilvl w:val="0"/>
+          <w:numId w:val="12"/>
+        </w:numPr>
+        <w:rPr>
+          <w:b/>
+          <w:bCs/>
+        </w:rPr>
+      </w:pPr>
+      <w:r>
+        <w:rPr>
+          <w:b/>
+          <w:bCs/>
+        </w:rPr>
+        <w:t xml:space="preserve">Prueba con tus datos móviles: Si tienes posibilidad, conecta la computadora un momento al </w:t>
+      </w:r>
+      <w:proofErr w:type="spellStart"/>
+      <w:r>
+        <w:rPr>
+          <w:b/>
+          <w:bCs/>
+        </w:rPr>
+        <w:t>Wi</w:t>
+      </w:r>
+      <w:proofErr w:type="spellEnd"/>
+      <w:r>
+        <w:rPr>
+          <w:b/>
+          <w:bCs/>
+        </w:rPr>
+        <w:t>-Fi de tu celular (</w:t>
+      </w:r>
+      <w:proofErr w:type="spellStart"/>
+      <w:r>
+        <w:rPr>
+          <w:b/>
+          <w:bCs/>
+        </w:rPr>
+        <w:t>Hotspot</w:t>
+      </w:r>
+      <w:proofErr w:type="spellEnd"/>
+      <w:r>
+        <w:rPr>
+          <w:b/>
+          <w:bCs/>
+        </w:rPr>
+        <w:t xml:space="preserve">) e intenta el </w:t>
+      </w:r>
+      <w:proofErr w:type="spellStart"/>
+      <w:r>
+        <w:rPr>
+          <w:b/>
+          <w:bCs/>
+        </w:rPr>
+        <w:t>git</w:t>
+      </w:r>
+      <w:proofErr w:type="spellEnd"/>
+      <w:r>
+        <w:rPr>
+          <w:b/>
+          <w:bCs/>
+        </w:rPr>
+        <w:t xml:space="preserve"> </w:t>
+      </w:r>
+      <w:proofErr w:type="spellStart"/>
+      <w:r>
+        <w:rPr>
+          <w:b/>
+          <w:bCs/>
+        </w:rPr>
+        <w:t>push</w:t>
+      </w:r>
+      <w:proofErr w:type="spellEnd"/>
+      <w:r>
+        <w:rPr>
+          <w:b/>
+          <w:bCs/>
+        </w:rPr>
+        <w:t>. Si funciona con tus datos, confirma que el problema es el bloqueo de la red de la escuela.</w:t>
+      </w:r>
+    </w:p>
+    <w:p>
+      <w:pPr>
+        <w:numPr>
+          <w:ilvl w:val="0"/>
+          <w:numId w:val="12"/>
+        </w:numPr>
+        <w:rPr>
+          <w:b/>
+          <w:bCs/>
+        </w:rPr>
+      </w:pPr>
+      <w:r>
+        <w:rPr>
+          <w:b/>
+          <w:bCs/>
+        </w:rPr>
+        <w:lastRenderedPageBreak/>
+        <w:t>Proxy: Si la escuela usa un Proxy para navegar, Git no lo sabe. Deberías configurar el proxy en Git (esto suele ser más complejo y requiere los datos del servidor de la escuela).</w:t>
+      </w:r>
+    </w:p>
+    <w:p>
+      <w:pPr>
+        <w:rPr>
+          <w:b/>
+          <w:bCs/>
+        </w:rPr>
+      </w:pPr>
+      <w:r>
+        <w:rPr>
+          <w:b/>
+          <w:bCs/>
+        </w:rPr>
+        <w:t>4. Cambiar los DNS de la computadora</w:t>
+      </w:r>
+    </w:p>
+    <w:p>
+      <w:pPr>
+        <w:rPr>
+          <w:b/>
+          <w:bCs/>
+        </w:rPr>
+      </w:pPr>
+      <w:r>
+        <w:rPr>
+          <w:b/>
+          <w:bCs/>
+        </w:rPr>
+        <w:t>Si tienes permisos de administrador, intenta cambiar los DNS de tu conexión de red a los de Google, que son más confiables que los automáticos:</w:t>
+      </w:r>
+    </w:p>
+    <w:p>
+      <w:pPr>
+        <w:numPr>
+          <w:ilvl w:val="0"/>
+          <w:numId w:val="13"/>
+        </w:numPr>
+        <w:rPr>
+          <w:b/>
+          <w:bCs/>
+        </w:rPr>
+      </w:pPr>
+      <w:r>
+        <w:rPr>
+          <w:b/>
+          <w:bCs/>
+        </w:rPr>
+        <w:t>DNS Primario: 8.8.8.8</w:t>
+      </w:r>
+    </w:p>
+    <w:p>
+      <w:pPr>
+        <w:numPr>
+          <w:ilvl w:val="0"/>
+          <w:numId w:val="13"/>
+        </w:numPr>
+        <w:rPr>
+          <w:b/>
+          <w:bCs/>
+        </w:rPr>
+      </w:pPr>
+      <w:r>
+        <w:rPr>
+          <w:b/>
+          <w:bCs/>
+        </w:rPr>
+        <w:t>DNS Secundario: 8.8.4.4</w:t>
+      </w:r>
+    </w:p>
+    <w:p>
+      <w:pPr>
+        <w:rPr>
+          <w:b/>
+          <w:bCs/>
+        </w:rPr>
+      </w:pPr>
+      <w:r>
+        <w:rPr>
+          <w:b/>
+          <w:bCs/>
+        </w:rPr>
+        <w:t>5. ¿GitHub está caído? (Poco probable)</w:t>
+      </w:r>
+    </w:p>
+    <w:p>
+      <w:pPr>
+        <w:rPr>
+          <w:b/>
+          <w:bCs/>
+        </w:rPr>
+      </w:pPr>
+      <w:r>
+        <w:rPr>
+          <w:b/>
+          <w:bCs/>
+        </w:rPr>
+        <w:t xml:space="preserve">Aunque es raro, puedes entrar a </w:t>
+      </w:r>
+      <w:hyperlink r:id="rId6" w:tgtFrame="_blank" w:history="1">
+        <w:r>
+          <w:rPr>
+            <w:rStyle w:val="Hipervnculo"/>
+            <w:b/>
+            <w:bCs/>
+          </w:rPr>
+          <w:t>githubstatus.com</w:t>
+        </w:r>
+      </w:hyperlink>
+      <w:r>
+        <w:rPr>
+          <w:b/>
+          <w:bCs/>
+        </w:rPr>
+        <w:t xml:space="preserve"> desde tu celular para ver si el servicio tiene problemas a nivel mundial.</w:t>
+      </w:r>
+    </w:p>
+    <w:p>
+      <w:pPr>
+        <w:rPr>
+          <w:b/>
+          <w:bCs/>
+        </w:rPr>
+      </w:pPr>
+      <w:r>
+        <w:rPr>
+          <w:rFonts w:ascii="Segoe UI Emoji" w:hAnsi="Segoe UI Emoji" w:cs="Segoe UI Emoji"/>
+          <w:b/>
+          <w:bCs/>
+        </w:rPr>
+        <w:t>💡</w:t>
+      </w:r>
+      <w:r>
+        <w:rPr>
+          <w:b/>
+          <w:bCs/>
+        </w:rPr>
+        <w:t xml:space="preserve"> Mi recomendación para tu clase hoy: Si estás con los alumnos y necesitas que suban el código sí o sí pero la red escolar no colabora:</w:t>
+      </w:r>
+    </w:p>
+    <w:p>
+      <w:pPr>
+        <w:numPr>
+          <w:ilvl w:val="0"/>
+          <w:numId w:val="14"/>
+        </w:numPr>
+        <w:rPr>
+          <w:b/>
+          <w:bCs/>
+        </w:rPr>
+      </w:pPr>
+      <w:r>
+        <w:rPr>
+          <w:b/>
+          <w:bCs/>
+        </w:rPr>
+        <w:t xml:space="preserve">Pídeles que guarden los cambios localmente con el </w:t>
+      </w:r>
+      <w:proofErr w:type="spellStart"/>
+      <w:r>
+        <w:rPr>
+          <w:b/>
+          <w:bCs/>
+        </w:rPr>
+        <w:t>git</w:t>
+      </w:r>
+      <w:proofErr w:type="spellEnd"/>
+      <w:r>
+        <w:rPr>
+          <w:b/>
+          <w:bCs/>
+        </w:rPr>
+        <w:t xml:space="preserve"> </w:t>
+      </w:r>
+      <w:proofErr w:type="spellStart"/>
+      <w:r>
+        <w:rPr>
+          <w:b/>
+          <w:bCs/>
+        </w:rPr>
+        <w:t>commit</w:t>
+      </w:r>
+      <w:proofErr w:type="spellEnd"/>
+      <w:r>
+        <w:rPr>
+          <w:b/>
+          <w:bCs/>
+        </w:rPr>
+        <w:t xml:space="preserve"> que ya hicieron.</w:t>
+      </w:r>
+    </w:p>
+    <w:p>
+      <w:pPr>
+        <w:numPr>
+          <w:ilvl w:val="0"/>
+          <w:numId w:val="14"/>
+        </w:numPr>
+        <w:rPr>
+          <w:b/>
+          <w:bCs/>
+        </w:rPr>
+      </w:pPr>
+      <w:r>
+        <w:rPr>
+          <w:b/>
+          <w:bCs/>
+        </w:rPr>
+        <w:t xml:space="preserve">Si el internet de la escuela sigue bloqueando a Git, que intenten el </w:t>
+      </w:r>
+      <w:proofErr w:type="spellStart"/>
+      <w:r>
+        <w:rPr>
+          <w:b/>
+          <w:bCs/>
+        </w:rPr>
+        <w:t>git</w:t>
+      </w:r>
+      <w:proofErr w:type="spellEnd"/>
+      <w:r>
+        <w:rPr>
+          <w:b/>
+          <w:bCs/>
+        </w:rPr>
+        <w:t xml:space="preserve"> </w:t>
+      </w:r>
+      <w:proofErr w:type="spellStart"/>
+      <w:r>
+        <w:rPr>
+          <w:b/>
+          <w:bCs/>
+        </w:rPr>
+        <w:t>push</w:t>
+      </w:r>
+      <w:proofErr w:type="spellEnd"/>
+      <w:r>
+        <w:rPr>
+          <w:b/>
+          <w:bCs/>
+        </w:rPr>
+        <w:t xml:space="preserve"> al final de la clase usando sus datos móviles o al llegar a sus casas.</w:t>
+      </w:r>
+    </w:p>
+    <w:p>
+      <w:pPr>
+        <w:numPr>
+          <w:ilvl w:val="0"/>
+          <w:numId w:val="14"/>
+        </w:numPr>
+        <w:rPr>
+          <w:b/>
+          <w:bCs/>
+        </w:rPr>
+      </w:pPr>
+      <w:r>
+        <w:rPr>
+          <w:b/>
+          <w:bCs/>
+        </w:rPr>
+        <w:t xml:space="preserve">Plan B: Pueden descargar el proyecto comprimido en un .zip y subirlo manualmente a la web de GitHub (botón </w:t>
+      </w:r>
+      <w:r>
+        <w:rPr>
+          <w:b/>
+          <w:bCs/>
+          <w:i/>
+          <w:iCs/>
+        </w:rPr>
+        <w:t>Add file</w:t>
+      </w:r>
+      <w:r>
+        <w:rPr>
+          <w:b/>
+          <w:bCs/>
+        </w:rPr>
+        <w:t xml:space="preserve"> -&gt; </w:t>
+      </w:r>
+      <w:proofErr w:type="spellStart"/>
+      <w:r>
+        <w:rPr>
+          <w:b/>
+          <w:bCs/>
+          <w:i/>
+          <w:iCs/>
+        </w:rPr>
+        <w:t>Upload</w:t>
+      </w:r>
+      <w:proofErr w:type="spellEnd"/>
+      <w:r>
+        <w:rPr>
+          <w:b/>
+          <w:bCs/>
+          <w:i/>
+          <w:iCs/>
+        </w:rPr>
+        <w:t xml:space="preserve"> files</w:t>
+      </w:r>
+      <w:r>
+        <w:rPr>
+          <w:b/>
+          <w:bCs/>
+        </w:rPr>
+        <w:t>), aunque no es lo ideal para aprender Git, sirve para no frenar la clase de Render.</w:t>
+      </w:r>
+    </w:p>
+    <w:p>
+      <w:pPr>
+        <w:rPr>
+          <w:b/>
+          <w:bCs/>
+        </w:rPr>
+      </w:pPr>
+      <w:r>
+        <w:rPr>
+          <w:b/>
+          <w:bCs/>
+        </w:rPr>
+        <w:t xml:space="preserve">¿Pudiste probar con otra red o realizar el </w:t>
+      </w:r>
+      <w:proofErr w:type="spellStart"/>
+      <w:r>
+        <w:rPr>
+          <w:b/>
+          <w:bCs/>
+        </w:rPr>
+        <w:t>flushdns</w:t>
+      </w:r>
+      <w:proofErr w:type="spellEnd"/>
+      <w:r>
+        <w:rPr>
+          <w:b/>
+          <w:bCs/>
+        </w:rPr>
+        <w:t>?</w:t>
+      </w:r>
+    </w:p>
+    <w:p>
+      <w:pPr>
+        <w:rPr>
+          <w:b/>
+          <w:bCs/>
+        </w:rPr>
+      </w:pPr>
+    </w:p>
+    <w:p>
+      <w:pPr>
+        <w:rPr>
+          <w:b/>
+          <w:bCs/>
+        </w:rPr>
+      </w:pPr>
+      <w:r>
+        <w:rPr>
+          <w:b/>
+          <w:bCs/>
+        </w:rPr>
+        <w:t>--------------------------------------------------</w:t>
+      </w:r>
+    </w:p>
+    <w:p>
+      <w:pPr>
+        <w:rPr>
+          <w:b/>
+          <w:bCs/>
+        </w:rPr>
+      </w:pPr>
     </w:p>
     <w:p>
       <w:pPr>
@@ -2675,7 +3876,6 @@
           <w:b/>
           <w:bCs/>
         </w:rPr>
-        <w:lastRenderedPageBreak/>
         <w:t>El proceso se divide en dos partes: crear la base de datos en Render y configurar tu código para que se adapte automáticamente si estás en tu computadora o en internet.</w:t>
       </w:r>
     </w:p>
@@ -2711,6 +3911,7 @@
           <w:b/>
           <w:bCs/>
         </w:rPr>
+        <w:lastRenderedPageBreak/>
         <w:t>Entrá</w:t>
       </w:r>
       <w:proofErr w:type="spellEnd"/>
@@ -3628,46 +4829,46 @@
           <w:b/>
           <w:bCs/>
         </w:rPr>
+        <w:t>Modificá</w:t>
+      </w:r>
+      <w:proofErr w:type="spellEnd"/>
+      <w:r>
+        <w:rPr>
+          <w:b/>
+          <w:bCs/>
+        </w:rPr>
+        <w:t xml:space="preserve"> la configuración de la base de datos en tu app.py para que quede de esta manera:</w:t>
+      </w:r>
+    </w:p>
+    <w:p>
+      <w:pPr>
+        <w:rPr>
+          <w:b/>
+          <w:bCs/>
+        </w:rPr>
+      </w:pPr>
+      <w:r>
+        <w:rPr>
+          <w:b/>
+          <w:bCs/>
+        </w:rPr>
+        <w:t>Python</w:t>
+      </w:r>
+    </w:p>
+    <w:p>
+      <w:pPr>
+        <w:rPr>
+          <w:b/>
+          <w:bCs/>
+        </w:rPr>
+      </w:pPr>
+      <w:proofErr w:type="spellStart"/>
+      <w:r>
+        <w:rPr>
+          <w:b/>
+          <w:bCs/>
+        </w:rPr>
         <w:lastRenderedPageBreak/>
-        <w:t>Modificá</w:t>
-      </w:r>
-      <w:proofErr w:type="spellEnd"/>
-      <w:r>
-        <w:rPr>
-          <w:b/>
-          <w:bCs/>
-        </w:rPr>
-        <w:t xml:space="preserve"> la configuración de la base de datos en tu app.py para que quede de esta manera:</w:t>
-      </w:r>
-    </w:p>
-    <w:p>
-      <w:pPr>
-        <w:rPr>
-          <w:b/>
-          <w:bCs/>
-        </w:rPr>
-      </w:pPr>
-      <w:r>
-        <w:rPr>
-          <w:b/>
-          <w:bCs/>
-        </w:rPr>
-        <w:t>Python</w:t>
-      </w:r>
-    </w:p>
-    <w:p>
-      <w:pPr>
-        <w:rPr>
-          <w:b/>
-          <w:bCs/>
-        </w:rPr>
-      </w:pPr>
-      <w:proofErr w:type="spellStart"/>
-      <w:r>
-        <w:rPr>
-          <w:b/>
-          <w:bCs/>
-        </w:rPr>
         <w:t>import</w:t>
       </w:r>
       <w:proofErr w:type="spellEnd"/>
@@ -4377,7 +5578,6 @@
           <w:b/>
           <w:bCs/>
         </w:rPr>
-        <w:lastRenderedPageBreak/>
         <w:t>Actualizá</w:t>
       </w:r>
       <w:proofErr w:type="spellEnd"/>
@@ -4460,6 +5660,7 @@
           <w:b/>
           <w:bCs/>
         </w:rPr>
+        <w:lastRenderedPageBreak/>
         <w:t>Subí este cambio a GitHub (</w:t>
       </w:r>
       <w:proofErr w:type="spellStart"/>
@@ -5021,13 +6222,16 @@
           <w:b/>
           <w:bCs/>
         </w:rPr>
+        <w:t>2. Velocidad de desarrollo y enfoque</w:t>
+      </w:r>
+    </w:p>
+    <w:p>
+      <w:r>
+        <w:t xml:space="preserve">Tu objetivo principal es estructurar el contenido de la asignatura: subir apuntes de ofimática, código de ejemplo de Python/Flask, y guías de JavaScript. Si te pones a </w:t>
+      </w:r>
+      <w:r>
         <w:lastRenderedPageBreak/>
-        <w:t>2. Velocidad de desarrollo y enfoque</w:t>
-      </w:r>
-    </w:p>
-    <w:p>
-      <w:r>
-        <w:t xml:space="preserve">Tu objetivo principal es estructurar el contenido de la asignatura: subir apuntes de ofimática, código de ejemplo de Python/Flask, y guías de JavaScript. Si te pones a renegar escribiendo </w:t>
+        <w:t xml:space="preserve">renegar escribiendo </w:t>
       </w:r>
       <w:r>
         <w:rPr>
@@ -5321,7 +6525,6 @@
         </w:pBdr>
       </w:pPr>
       <w:r>
-        <w:lastRenderedPageBreak/>
         <w:t xml:space="preserve">Si la web fuera </w:t>
       </w:r>
       <w:r>
@@ -5348,7 +6551,11 @@
       </w:r>
       <w:proofErr w:type="spellEnd"/>
       <w:r>
-        <w:t xml:space="preserve"> y @media a nivel atómico. Pero como tu web es un portal de contenidos completo que abarca desde ofimática hasta Flask, priorizar la velocidad y robustez de Bootstrap es la decisión más inteligente.</w:t>
+        <w:t xml:space="preserve"> y @media a nivel atómico. Pero como tu web es un portal de contenidos completo que abarca desde ofimática </w:t>
+      </w:r>
+      <w:r>
+        <w:lastRenderedPageBreak/>
+        <w:t>hasta Flask, priorizar la velocidad y robustez de Bootstrap es la decisión más inteligente.</w:t>
       </w:r>
     </w:p>
     <w:p>
@@ -5797,7 +7004,6 @@
         <w:rPr>
           <w:lang w:val="en-US"/>
         </w:rPr>
-        <w:lastRenderedPageBreak/>
         <w:t xml:space="preserve">def </w:t>
       </w:r>
       <w:proofErr w:type="spellStart"/>
@@ -6211,12 +7417,12 @@
     </w:p>
     <w:p>
       <w:r>
+        <w:t xml:space="preserve">                &lt;p&gt;Aunque cambies tu nombre local, Windows tiende a recordar el usuario de GitHub de la última persona que trabajó. Si no prestamos atención, ¡subirás tu tarea al perfil de tu compañero!&lt;/p&gt;</w:t>
+      </w:r>
+    </w:p>
+    <w:p>
+      <w:r>
         <w:lastRenderedPageBreak/>
-        <w:t xml:space="preserve">                &lt;p&gt;Aunque cambies tu nombre local, Windows tiende a recordar el usuario de GitHub de la última persona que trabajó. Si no prestamos atención, ¡subirás tu tarea al perfil de tu compañero!&lt;/p&gt;</w:t>
-      </w:r>
-    </w:p>
-    <w:p>
-      <w:r>
         <w:t xml:space="preserve">                &lt;</w:t>
       </w:r>
       <w:proofErr w:type="spellStart"/>
@@ -6859,15 +8065,15 @@
         <w:rPr>
           <w:lang w:val="en-US"/>
         </w:rPr>
+        <w:t xml:space="preserve">                    &lt;div class="alert alert-warning py-1 font-monospace small"&gt;</w:t>
+      </w:r>
+    </w:p>
+    <w:p>
+      <w:r>
+        <w:rPr>
+          <w:lang w:val="en-US"/>
+        </w:rPr>
         <w:lastRenderedPageBreak/>
-        <w:t xml:space="preserve">                    &lt;div class="alert alert-warning py-1 font-monospace small"&gt;</w:t>
-      </w:r>
-    </w:p>
-    <w:p>
-      <w:r>
-        <w:rPr>
-          <w:lang w:val="en-US"/>
-        </w:rPr>
         <w:t xml:space="preserve">                        </w:t>
       </w:r>
       <w:r>
@@ -7314,52 +8520,52 @@
     </w:p>
     <w:p>
       <w:r>
+        <w:t xml:space="preserve">                        &lt;</w:t>
+      </w:r>
+      <w:proofErr w:type="spellStart"/>
+      <w:r>
+        <w:t>li</w:t>
+      </w:r>
+      <w:proofErr w:type="spellEnd"/>
+      <w:r>
+        <w:t>&gt;&lt;</w:t>
+      </w:r>
+      <w:proofErr w:type="spellStart"/>
+      <w:r>
+        <w:t>strong</w:t>
+      </w:r>
+      <w:proofErr w:type="spellEnd"/>
+      <w:r>
+        <w:t>&gt;</w:t>
+      </w:r>
+      <w:proofErr w:type="spellStart"/>
+      <w:r>
+        <w:t>Username</w:t>
+      </w:r>
+      <w:proofErr w:type="spellEnd"/>
+      <w:r>
+        <w:t>:&lt;/</w:t>
+      </w:r>
+      <w:proofErr w:type="spellStart"/>
+      <w:r>
+        <w:t>strong</w:t>
+      </w:r>
+      <w:proofErr w:type="spellEnd"/>
+      <w:r>
+        <w:t>&gt; Escribe tu usuario de GitHub.&lt;/</w:t>
+      </w:r>
+      <w:proofErr w:type="spellStart"/>
+      <w:r>
+        <w:t>li</w:t>
+      </w:r>
+      <w:proofErr w:type="spellEnd"/>
+      <w:r>
+        <w:t>&gt;</w:t>
+      </w:r>
+    </w:p>
+    <w:p>
+      <w:r>
         <w:lastRenderedPageBreak/>
-        <w:t xml:space="preserve">                        &lt;</w:t>
-      </w:r>
-      <w:proofErr w:type="spellStart"/>
-      <w:r>
-        <w:t>li</w:t>
-      </w:r>
-      <w:proofErr w:type="spellEnd"/>
-      <w:r>
-        <w:t>&gt;&lt;</w:t>
-      </w:r>
-      <w:proofErr w:type="spellStart"/>
-      <w:r>
-        <w:t>strong</w:t>
-      </w:r>
-      <w:proofErr w:type="spellEnd"/>
-      <w:r>
-        <w:t>&gt;</w:t>
-      </w:r>
-      <w:proofErr w:type="spellStart"/>
-      <w:r>
-        <w:t>Username</w:t>
-      </w:r>
-      <w:proofErr w:type="spellEnd"/>
-      <w:r>
-        <w:t>:&lt;/</w:t>
-      </w:r>
-      <w:proofErr w:type="spellStart"/>
-      <w:r>
-        <w:t>strong</w:t>
-      </w:r>
-      <w:proofErr w:type="spellEnd"/>
-      <w:r>
-        <w:t>&gt; Escribe tu usuario de GitHub.&lt;/</w:t>
-      </w:r>
-      <w:proofErr w:type="spellStart"/>
-      <w:r>
-        <w:t>li</w:t>
-      </w:r>
-      <w:proofErr w:type="spellEnd"/>
-      <w:r>
-        <w:t>&gt;</w:t>
-      </w:r>
-    </w:p>
-    <w:p>
-      <w:r>
         <w:t xml:space="preserve">                        </w:t>
       </w:r>
       <w:r>
@@ -7587,6 +8793,155 @@
 <file path=word/numbering.xml><?xml version="1.0" encoding="utf-8"?>
 <w:numbering xmlns:wpc="http://schemas.microsoft.com/office/word/2010/wordprocessingCanvas" xmlns:cx="http://schemas.microsoft.com/office/drawing/2014/chartex" xmlns:cx1="http://schemas.microsoft.com/office/drawing/2015/9/8/chartex" xmlns:cx2="http://schemas.microsoft.com/office/drawing/2015/10/21/chartex" xmlns:cx3="http://schemas.microsoft.com/office/drawing/2016/5/9/chartex" xmlns:cx4="http://schemas.microsoft.com/office/drawing/2016/5/10/chartex" xmlns:cx5="http://schemas.microsoft.com/office/drawing/2016/5/11/chartex" xmlns:cx6="http://schemas.microsoft.com/office/drawing/2016/5/12/chartex" xmlns:cx7="http://schemas.microsoft.com/office/drawing/2016/5/13/chartex" xmlns:cx8="http://schemas.microsoft.com/office/drawing/2016/5/14/chartex" xmlns:mc="http://schemas.openxmlformats.org/markup-compatibility/2006" xmlns:aink="http://schemas.microsoft.com/office/drawing/2016/ink" xmlns:am3d="http://schemas.microsoft.com/office/drawing/2017/model3d" xmlns:o="urn:schemas-microsoft-com:office:office" xmlns:oel="http://schemas.microsoft.com/office/2019/extlst" xmlns:r="http://schemas.openxmlformats.org/officeDocument/2006/relationships" xmlns:m="http://schemas.openxmlformats.org/officeDocument/2006/math" xmlns:v="urn:schemas-microsoft-com:vml" xmlns:wp14="http://schemas.microsoft.com/office/word/2010/wordprocessingDrawing" xmlns:wp="http://schemas.openxmlformats.org/drawingml/2006/wordprocessingDrawing" xmlns:w10="urn:schemas-microsoft-com:office:word" xmlns:w="http://schemas.openxmlformats.org/wordprocessingml/2006/main" xmlns:w14="http://schemas.microsoft.com/office/word/2010/wordml" xmlns:w15="http://schemas.microsoft.com/office/word/2012/wordml" xmlns:w16cex="http://schemas.microsoft.com/office/word/2018/wordml/cex" xmlns:w16cid="http://schemas.microsoft.com/office/word/2016/wordml/cid" xmlns:w16="http://schemas.microsoft.com/office/word/2018/wordml" xmlns:w16du="http://schemas.microsoft.com/office/word/2023/wordml/word16du" xmlns:w16sdtdh="http://schemas.microsoft.com/office/word/2020/wordml/sdtdatahash" xmlns:w16sdtfl="http://schemas.microsoft.com/office/word/2024/wordml/sdtformatlock" xmlns:w16se="http://schemas.microsoft.com/office/word/2015/wordml/symex" xmlns:wpg="http://schemas.microsoft.com/office/word/2010/wordprocessingGroup" xmlns:wpi="http://schemas.microsoft.com/office/word/2010/wordprocessingInk" xmlns:wne="http://schemas.microsoft.com/office/word/2006/wordml" xmlns:wps="http://schemas.microsoft.com/office/word/2010/wordprocessingShape" mc:Ignorable="w14 w15 w16se w16cid w16 w16cex w16sdtdh w16sdtfl w16du wp14">
   <w:abstractNum w:abstractNumId="0" w15:restartNumberingAfterBreak="0">
+    <w:nsid w:val="0A4B0E65"/>
+    <w:multiLevelType w:val="multilevel"/>
+    <w:tmpl w:val="CAEEB4D2"/>
+    <w:lvl w:ilvl="0">
+      <w:start w:val="1"/>
+      <w:numFmt w:val="bullet"/>
+      <w:lvlText w:val=""/>
+      <w:lvlJc w:val="left"/>
+      <w:pPr>
+        <w:tabs>
+          <w:tab w:val="num" w:pos="720"/>
+        </w:tabs>
+        <w:ind w:left="720" w:hanging="360"/>
+      </w:pPr>
+      <w:rPr>
+        <w:rFonts w:ascii="Symbol" w:hAnsi="Symbol" w:hint="default"/>
+        <w:sz w:val="20"/>
+      </w:rPr>
+    </w:lvl>
+    <w:lvl w:ilvl="1" w:tentative="1">
+      <w:start w:val="1"/>
+      <w:numFmt w:val="bullet"/>
+      <w:lvlText w:val="o"/>
+      <w:lvlJc w:val="left"/>
+      <w:pPr>
+        <w:tabs>
+          <w:tab w:val="num" w:pos="1440"/>
+        </w:tabs>
+        <w:ind w:left="1440" w:hanging="360"/>
+      </w:pPr>
+      <w:rPr>
+        <w:rFonts w:ascii="Courier New" w:hAnsi="Courier New" w:hint="default"/>
+        <w:sz w:val="20"/>
+      </w:rPr>
+    </w:lvl>
+    <w:lvl w:ilvl="2" w:tentative="1">
+      <w:start w:val="1"/>
+      <w:numFmt w:val="bullet"/>
+      <w:lvlText w:val=""/>
+      <w:lvlJc w:val="left"/>
+      <w:pPr>
+        <w:tabs>
+          <w:tab w:val="num" w:pos="2160"/>
+        </w:tabs>
+        <w:ind w:left="2160" w:hanging="360"/>
+      </w:pPr>
+      <w:rPr>
+        <w:rFonts w:ascii="Wingdings" w:hAnsi="Wingdings" w:hint="default"/>
+        <w:sz w:val="20"/>
+      </w:rPr>
+    </w:lvl>
+    <w:lvl w:ilvl="3" w:tentative="1">
+      <w:start w:val="1"/>
+      <w:numFmt w:val="bullet"/>
+      <w:lvlText w:val=""/>
+      <w:lvlJc w:val="left"/>
+      <w:pPr>
+        <w:tabs>
+          <w:tab w:val="num" w:pos="2880"/>
+        </w:tabs>
+        <w:ind w:left="2880" w:hanging="360"/>
+      </w:pPr>
+      <w:rPr>
+        <w:rFonts w:ascii="Wingdings" w:hAnsi="Wingdings" w:hint="default"/>
+        <w:sz w:val="20"/>
+      </w:rPr>
+    </w:lvl>
+    <w:lvl w:ilvl="4" w:tentative="1">
+      <w:start w:val="1"/>
+      <w:numFmt w:val="bullet"/>
+      <w:lvlText w:val=""/>
+      <w:lvlJc w:val="left"/>
+      <w:pPr>
+        <w:tabs>
+          <w:tab w:val="num" w:pos="3600"/>
+        </w:tabs>
+        <w:ind w:left="3600" w:hanging="360"/>
+      </w:pPr>
+      <w:rPr>
+        <w:rFonts w:ascii="Wingdings" w:hAnsi="Wingdings" w:hint="default"/>
+        <w:sz w:val="20"/>
+      </w:rPr>
+    </w:lvl>
+    <w:lvl w:ilvl="5" w:tentative="1">
+      <w:start w:val="1"/>
+      <w:numFmt w:val="bullet"/>
+      <w:lvlText w:val=""/>
+      <w:lvlJc w:val="left"/>
+      <w:pPr>
+        <w:tabs>
+          <w:tab w:val="num" w:pos="4320"/>
+        </w:tabs>
+        <w:ind w:left="4320" w:hanging="360"/>
+      </w:pPr>
+      <w:rPr>
+        <w:rFonts w:ascii="Wingdings" w:hAnsi="Wingdings" w:hint="default"/>
+        <w:sz w:val="20"/>
+      </w:rPr>
+    </w:lvl>
+    <w:lvl w:ilvl="6" w:tentative="1">
+      <w:start w:val="1"/>
+      <w:numFmt w:val="bullet"/>
+      <w:lvlText w:val=""/>
+      <w:lvlJc w:val="left"/>
+      <w:pPr>
+        <w:tabs>
+          <w:tab w:val="num" w:pos="5040"/>
+        </w:tabs>
+        <w:ind w:left="5040" w:hanging="360"/>
+      </w:pPr>
+      <w:rPr>
+        <w:rFonts w:ascii="Wingdings" w:hAnsi="Wingdings" w:hint="default"/>
+        <w:sz w:val="20"/>
+      </w:rPr>
+    </w:lvl>
+    <w:lvl w:ilvl="7" w:tentative="1">
+      <w:start w:val="1"/>
+      <w:numFmt w:val="bullet"/>
+      <w:lvlText w:val=""/>
+      <w:lvlJc w:val="left"/>
+      <w:pPr>
+        <w:tabs>
+          <w:tab w:val="num" w:pos="5760"/>
+        </w:tabs>
+        <w:ind w:left="5760" w:hanging="360"/>
+      </w:pPr>
+      <w:rPr>
+        <w:rFonts w:ascii="Wingdings" w:hAnsi="Wingdings" w:hint="default"/>
+        <w:sz w:val="20"/>
+      </w:rPr>
+    </w:lvl>
+    <w:lvl w:ilvl="8" w:tentative="1">
+      <w:start w:val="1"/>
+      <w:numFmt w:val="bullet"/>
+      <w:lvlText w:val=""/>
+      <w:lvlJc w:val="left"/>
+      <w:pPr>
+        <w:tabs>
+          <w:tab w:val="num" w:pos="6480"/>
+        </w:tabs>
+        <w:ind w:left="6480" w:hanging="360"/>
+      </w:pPr>
+      <w:rPr>
+        <w:rFonts w:ascii="Wingdings" w:hAnsi="Wingdings" w:hint="default"/>
+        <w:sz w:val="20"/>
+      </w:rPr>
+    </w:lvl>
+  </w:abstractNum>
+  <w:abstractNum w:abstractNumId="1" w15:restartNumberingAfterBreak="0">
     <w:nsid w:val="1C563F8E"/>
     <w:multiLevelType w:val="multilevel"/>
     <w:tmpl w:val="D81093DC"/>
@@ -7735,7 +9090,7 @@
       </w:rPr>
     </w:lvl>
   </w:abstractNum>
-  <w:abstractNum w:abstractNumId="1" w15:restartNumberingAfterBreak="0">
+  <w:abstractNum w:abstractNumId="2" w15:restartNumberingAfterBreak="0">
     <w:nsid w:val="2234539D"/>
     <w:multiLevelType w:val="multilevel"/>
     <w:tmpl w:val="DA244A56"/>
@@ -7848,7 +9203,156 @@
       </w:pPr>
     </w:lvl>
   </w:abstractNum>
-  <w:abstractNum w:abstractNumId="2" w15:restartNumberingAfterBreak="0">
+  <w:abstractNum w:abstractNumId="3" w15:restartNumberingAfterBreak="0">
+    <w:nsid w:val="265A7152"/>
+    <w:multiLevelType w:val="multilevel"/>
+    <w:tmpl w:val="28FA42B8"/>
+    <w:lvl w:ilvl="0">
+      <w:start w:val="1"/>
+      <w:numFmt w:val="bullet"/>
+      <w:lvlText w:val=""/>
+      <w:lvlJc w:val="left"/>
+      <w:pPr>
+        <w:tabs>
+          <w:tab w:val="num" w:pos="720"/>
+        </w:tabs>
+        <w:ind w:left="720" w:hanging="360"/>
+      </w:pPr>
+      <w:rPr>
+        <w:rFonts w:ascii="Symbol" w:hAnsi="Symbol" w:hint="default"/>
+        <w:sz w:val="20"/>
+      </w:rPr>
+    </w:lvl>
+    <w:lvl w:ilvl="1" w:tentative="1">
+      <w:start w:val="1"/>
+      <w:numFmt w:val="bullet"/>
+      <w:lvlText w:val="o"/>
+      <w:lvlJc w:val="left"/>
+      <w:pPr>
+        <w:tabs>
+          <w:tab w:val="num" w:pos="1440"/>
+        </w:tabs>
+        <w:ind w:left="1440" w:hanging="360"/>
+      </w:pPr>
+      <w:rPr>
+        <w:rFonts w:ascii="Courier New" w:hAnsi="Courier New" w:hint="default"/>
+        <w:sz w:val="20"/>
+      </w:rPr>
+    </w:lvl>
+    <w:lvl w:ilvl="2" w:tentative="1">
+      <w:start w:val="1"/>
+      <w:numFmt w:val="bullet"/>
+      <w:lvlText w:val=""/>
+      <w:lvlJc w:val="left"/>
+      <w:pPr>
+        <w:tabs>
+          <w:tab w:val="num" w:pos="2160"/>
+        </w:tabs>
+        <w:ind w:left="2160" w:hanging="360"/>
+      </w:pPr>
+      <w:rPr>
+        <w:rFonts w:ascii="Wingdings" w:hAnsi="Wingdings" w:hint="default"/>
+        <w:sz w:val="20"/>
+      </w:rPr>
+    </w:lvl>
+    <w:lvl w:ilvl="3" w:tentative="1">
+      <w:start w:val="1"/>
+      <w:numFmt w:val="bullet"/>
+      <w:lvlText w:val=""/>
+      <w:lvlJc w:val="left"/>
+      <w:pPr>
+        <w:tabs>
+          <w:tab w:val="num" w:pos="2880"/>
+        </w:tabs>
+        <w:ind w:left="2880" w:hanging="360"/>
+      </w:pPr>
+      <w:rPr>
+        <w:rFonts w:ascii="Wingdings" w:hAnsi="Wingdings" w:hint="default"/>
+        <w:sz w:val="20"/>
+      </w:rPr>
+    </w:lvl>
+    <w:lvl w:ilvl="4" w:tentative="1">
+      <w:start w:val="1"/>
+      <w:numFmt w:val="bullet"/>
+      <w:lvlText w:val=""/>
+      <w:lvlJc w:val="left"/>
+      <w:pPr>
+        <w:tabs>
+          <w:tab w:val="num" w:pos="3600"/>
+        </w:tabs>
+        <w:ind w:left="3600" w:hanging="360"/>
+      </w:pPr>
+      <w:rPr>
+        <w:rFonts w:ascii="Wingdings" w:hAnsi="Wingdings" w:hint="default"/>
+        <w:sz w:val="20"/>
+      </w:rPr>
+    </w:lvl>
+    <w:lvl w:ilvl="5" w:tentative="1">
+      <w:start w:val="1"/>
+      <w:numFmt w:val="bullet"/>
+      <w:lvlText w:val=""/>
+      <w:lvlJc w:val="left"/>
+      <w:pPr>
+        <w:tabs>
+          <w:tab w:val="num" w:pos="4320"/>
+        </w:tabs>
+        <w:ind w:left="4320" w:hanging="360"/>
+      </w:pPr>
+      <w:rPr>
+        <w:rFonts w:ascii="Wingdings" w:hAnsi="Wingdings" w:hint="default"/>
+        <w:sz w:val="20"/>
+      </w:rPr>
+    </w:lvl>
+    <w:lvl w:ilvl="6" w:tentative="1">
+      <w:start w:val="1"/>
+      <w:numFmt w:val="bullet"/>
+      <w:lvlText w:val=""/>
+      <w:lvlJc w:val="left"/>
+      <w:pPr>
+        <w:tabs>
+          <w:tab w:val="num" w:pos="5040"/>
+        </w:tabs>
+        <w:ind w:left="5040" w:hanging="360"/>
+      </w:pPr>
+      <w:rPr>
+        <w:rFonts w:ascii="Wingdings" w:hAnsi="Wingdings" w:hint="default"/>
+        <w:sz w:val="20"/>
+      </w:rPr>
+    </w:lvl>
+    <w:lvl w:ilvl="7" w:tentative="1">
+      <w:start w:val="1"/>
+      <w:numFmt w:val="bullet"/>
+      <w:lvlText w:val=""/>
+      <w:lvlJc w:val="left"/>
+      <w:pPr>
+        <w:tabs>
+          <w:tab w:val="num" w:pos="5760"/>
+        </w:tabs>
+        <w:ind w:left="5760" w:hanging="360"/>
+      </w:pPr>
+      <w:rPr>
+        <w:rFonts w:ascii="Wingdings" w:hAnsi="Wingdings" w:hint="default"/>
+        <w:sz w:val="20"/>
+      </w:rPr>
+    </w:lvl>
+    <w:lvl w:ilvl="8" w:tentative="1">
+      <w:start w:val="1"/>
+      <w:numFmt w:val="bullet"/>
+      <w:lvlText w:val=""/>
+      <w:lvlJc w:val="left"/>
+      <w:pPr>
+        <w:tabs>
+          <w:tab w:val="num" w:pos="6480"/>
+        </w:tabs>
+        <w:ind w:left="6480" w:hanging="360"/>
+      </w:pPr>
+      <w:rPr>
+        <w:rFonts w:ascii="Wingdings" w:hAnsi="Wingdings" w:hint="default"/>
+        <w:sz w:val="20"/>
+      </w:rPr>
+    </w:lvl>
+  </w:abstractNum>
+  <w:abstractNum w:abstractNumId="4" w15:restartNumberingAfterBreak="0">
     <w:nsid w:val="4CA8055D"/>
     <w:multiLevelType w:val="multilevel"/>
     <w:tmpl w:val="DA48AD50"/>
@@ -7961,7 +9465,7 @@
       </w:pPr>
     </w:lvl>
   </w:abstractNum>
-  <w:abstractNum w:abstractNumId="3" w15:restartNumberingAfterBreak="0">
+  <w:abstractNum w:abstractNumId="5" w15:restartNumberingAfterBreak="0">
     <w:nsid w:val="4FAF446E"/>
     <w:multiLevelType w:val="multilevel"/>
     <w:tmpl w:val="FAFE94E8"/>
@@ -8110,7 +9614,120 @@
       </w:rPr>
     </w:lvl>
   </w:abstractNum>
-  <w:abstractNum w:abstractNumId="4" w15:restartNumberingAfterBreak="0">
+  <w:abstractNum w:abstractNumId="6" w15:restartNumberingAfterBreak="0">
+    <w:nsid w:val="506450B7"/>
+    <w:multiLevelType w:val="multilevel"/>
+    <w:tmpl w:val="71368BFE"/>
+    <w:lvl w:ilvl="0">
+      <w:start w:val="1"/>
+      <w:numFmt w:val="decimal"/>
+      <w:lvlText w:val="%1."/>
+      <w:lvlJc w:val="left"/>
+      <w:pPr>
+        <w:tabs>
+          <w:tab w:val="num" w:pos="720"/>
+        </w:tabs>
+        <w:ind w:left="720" w:hanging="360"/>
+      </w:pPr>
+    </w:lvl>
+    <w:lvl w:ilvl="1" w:tentative="1">
+      <w:start w:val="1"/>
+      <w:numFmt w:val="decimal"/>
+      <w:lvlText w:val="%2."/>
+      <w:lvlJc w:val="left"/>
+      <w:pPr>
+        <w:tabs>
+          <w:tab w:val="num" w:pos="1440"/>
+        </w:tabs>
+        <w:ind w:left="1440" w:hanging="360"/>
+      </w:pPr>
+    </w:lvl>
+    <w:lvl w:ilvl="2" w:tentative="1">
+      <w:start w:val="1"/>
+      <w:numFmt w:val="decimal"/>
+      <w:lvlText w:val="%3."/>
+      <w:lvlJc w:val="left"/>
+      <w:pPr>
+        <w:tabs>
+          <w:tab w:val="num" w:pos="2160"/>
+        </w:tabs>
+        <w:ind w:left="2160" w:hanging="360"/>
+      </w:pPr>
+    </w:lvl>
+    <w:lvl w:ilvl="3" w:tentative="1">
+      <w:start w:val="1"/>
+      <w:numFmt w:val="decimal"/>
+      <w:lvlText w:val="%4."/>
+      <w:lvlJc w:val="left"/>
+      <w:pPr>
+        <w:tabs>
+          <w:tab w:val="num" w:pos="2880"/>
+        </w:tabs>
+        <w:ind w:left="2880" w:hanging="360"/>
+      </w:pPr>
+    </w:lvl>
+    <w:lvl w:ilvl="4" w:tentative="1">
+      <w:start w:val="1"/>
+      <w:numFmt w:val="decimal"/>
+      <w:lvlText w:val="%5."/>
+      <w:lvlJc w:val="left"/>
+      <w:pPr>
+        <w:tabs>
+          <w:tab w:val="num" w:pos="3600"/>
+        </w:tabs>
+        <w:ind w:left="3600" w:hanging="360"/>
+      </w:pPr>
+    </w:lvl>
+    <w:lvl w:ilvl="5" w:tentative="1">
+      <w:start w:val="1"/>
+      <w:numFmt w:val="decimal"/>
+      <w:lvlText w:val="%6."/>
+      <w:lvlJc w:val="left"/>
+      <w:pPr>
+        <w:tabs>
+          <w:tab w:val="num" w:pos="4320"/>
+        </w:tabs>
+        <w:ind w:left="4320" w:hanging="360"/>
+      </w:pPr>
+    </w:lvl>
+    <w:lvl w:ilvl="6" w:tentative="1">
+      <w:start w:val="1"/>
+      <w:numFmt w:val="decimal"/>
+      <w:lvlText w:val="%7."/>
+      <w:lvlJc w:val="left"/>
+      <w:pPr>
+        <w:tabs>
+          <w:tab w:val="num" w:pos="5040"/>
+        </w:tabs>
+        <w:ind w:left="5040" w:hanging="360"/>
+      </w:pPr>
+    </w:lvl>
+    <w:lvl w:ilvl="7" w:tentative="1">
+      <w:start w:val="1"/>
+      <w:numFmt w:val="decimal"/>
+      <w:lvlText w:val="%8."/>
+      <w:lvlJc w:val="left"/>
+      <w:pPr>
+        <w:tabs>
+          <w:tab w:val="num" w:pos="5760"/>
+        </w:tabs>
+        <w:ind w:left="5760" w:hanging="360"/>
+      </w:pPr>
+    </w:lvl>
+    <w:lvl w:ilvl="8" w:tentative="1">
+      <w:start w:val="1"/>
+      <w:numFmt w:val="decimal"/>
+      <w:lvlText w:val="%9."/>
+      <w:lvlJc w:val="left"/>
+      <w:pPr>
+        <w:tabs>
+          <w:tab w:val="num" w:pos="6480"/>
+        </w:tabs>
+        <w:ind w:left="6480" w:hanging="360"/>
+      </w:pPr>
+    </w:lvl>
+  </w:abstractNum>
+  <w:abstractNum w:abstractNumId="7" w15:restartNumberingAfterBreak="0">
     <w:nsid w:val="507F60C2"/>
     <w:multiLevelType w:val="multilevel"/>
     <w:tmpl w:val="6644CCC8"/>
@@ -8223,7 +9840,7 @@
       </w:pPr>
     </w:lvl>
   </w:abstractNum>
-  <w:abstractNum w:abstractNumId="5" w15:restartNumberingAfterBreak="0">
+  <w:abstractNum w:abstractNumId="8" w15:restartNumberingAfterBreak="0">
     <w:nsid w:val="59BA7DE2"/>
     <w:multiLevelType w:val="multilevel"/>
     <w:tmpl w:val="2474EE64"/>
@@ -8340,7 +9957,7 @@
       </w:pPr>
     </w:lvl>
   </w:abstractNum>
-  <w:abstractNum w:abstractNumId="6" w15:restartNumberingAfterBreak="0">
+  <w:abstractNum w:abstractNumId="9" w15:restartNumberingAfterBreak="0">
     <w:nsid w:val="5D222623"/>
     <w:multiLevelType w:val="multilevel"/>
     <w:tmpl w:val="9E8A9AE6"/>
@@ -8453,7 +10070,269 @@
       </w:pPr>
     </w:lvl>
   </w:abstractNum>
-  <w:abstractNum w:abstractNumId="7" w15:restartNumberingAfterBreak="0">
+  <w:abstractNum w:abstractNumId="10" w15:restartNumberingAfterBreak="0">
+    <w:nsid w:val="64F552F6"/>
+    <w:multiLevelType w:val="multilevel"/>
+    <w:tmpl w:val="EB3AD756"/>
+    <w:lvl w:ilvl="0">
+      <w:start w:val="1"/>
+      <w:numFmt w:val="decimal"/>
+      <w:lvlText w:val="%1."/>
+      <w:lvlJc w:val="left"/>
+      <w:pPr>
+        <w:tabs>
+          <w:tab w:val="num" w:pos="720"/>
+        </w:tabs>
+        <w:ind w:left="720" w:hanging="360"/>
+      </w:pPr>
+    </w:lvl>
+    <w:lvl w:ilvl="1" w:tentative="1">
+      <w:start w:val="1"/>
+      <w:numFmt w:val="decimal"/>
+      <w:lvlText w:val="%2."/>
+      <w:lvlJc w:val="left"/>
+      <w:pPr>
+        <w:tabs>
+          <w:tab w:val="num" w:pos="1440"/>
+        </w:tabs>
+        <w:ind w:left="1440" w:hanging="360"/>
+      </w:pPr>
+    </w:lvl>
+    <w:lvl w:ilvl="2" w:tentative="1">
+      <w:start w:val="1"/>
+      <w:numFmt w:val="decimal"/>
+      <w:lvlText w:val="%3."/>
+      <w:lvlJc w:val="left"/>
+      <w:pPr>
+        <w:tabs>
+          <w:tab w:val="num" w:pos="2160"/>
+        </w:tabs>
+        <w:ind w:left="2160" w:hanging="360"/>
+      </w:pPr>
+    </w:lvl>
+    <w:lvl w:ilvl="3" w:tentative="1">
+      <w:start w:val="1"/>
+      <w:numFmt w:val="decimal"/>
+      <w:lvlText w:val="%4."/>
+      <w:lvlJc w:val="left"/>
+      <w:pPr>
+        <w:tabs>
+          <w:tab w:val="num" w:pos="2880"/>
+        </w:tabs>
+        <w:ind w:left="2880" w:hanging="360"/>
+      </w:pPr>
+    </w:lvl>
+    <w:lvl w:ilvl="4" w:tentative="1">
+      <w:start w:val="1"/>
+      <w:numFmt w:val="decimal"/>
+      <w:lvlText w:val="%5."/>
+      <w:lvlJc w:val="left"/>
+      <w:pPr>
+        <w:tabs>
+          <w:tab w:val="num" w:pos="3600"/>
+        </w:tabs>
+        <w:ind w:left="3600" w:hanging="360"/>
+      </w:pPr>
+    </w:lvl>
+    <w:lvl w:ilvl="5" w:tentative="1">
+      <w:start w:val="1"/>
+      <w:numFmt w:val="decimal"/>
+      <w:lvlText w:val="%6."/>
+      <w:lvlJc w:val="left"/>
+      <w:pPr>
+        <w:tabs>
+          <w:tab w:val="num" w:pos="4320"/>
+        </w:tabs>
+        <w:ind w:left="4320" w:hanging="360"/>
+      </w:pPr>
+    </w:lvl>
+    <w:lvl w:ilvl="6" w:tentative="1">
+      <w:start w:val="1"/>
+      <w:numFmt w:val="decimal"/>
+      <w:lvlText w:val="%7."/>
+      <w:lvlJc w:val="left"/>
+      <w:pPr>
+        <w:tabs>
+          <w:tab w:val="num" w:pos="5040"/>
+        </w:tabs>
+        <w:ind w:left="5040" w:hanging="360"/>
+      </w:pPr>
+    </w:lvl>
+    <w:lvl w:ilvl="7" w:tentative="1">
+      <w:start w:val="1"/>
+      <w:numFmt w:val="decimal"/>
+      <w:lvlText w:val="%8."/>
+      <w:lvlJc w:val="left"/>
+      <w:pPr>
+        <w:tabs>
+          <w:tab w:val="num" w:pos="5760"/>
+        </w:tabs>
+        <w:ind w:left="5760" w:hanging="360"/>
+      </w:pPr>
+    </w:lvl>
+    <w:lvl w:ilvl="8" w:tentative="1">
+      <w:start w:val="1"/>
+      <w:numFmt w:val="decimal"/>
+      <w:lvlText w:val="%9."/>
+      <w:lvlJc w:val="left"/>
+      <w:pPr>
+        <w:tabs>
+          <w:tab w:val="num" w:pos="6480"/>
+        </w:tabs>
+        <w:ind w:left="6480" w:hanging="360"/>
+      </w:pPr>
+    </w:lvl>
+  </w:abstractNum>
+  <w:abstractNum w:abstractNumId="11" w15:restartNumberingAfterBreak="0">
+    <w:nsid w:val="67E91705"/>
+    <w:multiLevelType w:val="multilevel"/>
+    <w:tmpl w:val="9904A614"/>
+    <w:lvl w:ilvl="0">
+      <w:start w:val="1"/>
+      <w:numFmt w:val="bullet"/>
+      <w:lvlText w:val=""/>
+      <w:lvlJc w:val="left"/>
+      <w:pPr>
+        <w:tabs>
+          <w:tab w:val="num" w:pos="720"/>
+        </w:tabs>
+        <w:ind w:left="720" w:hanging="360"/>
+      </w:pPr>
+      <w:rPr>
+        <w:rFonts w:ascii="Symbol" w:hAnsi="Symbol" w:hint="default"/>
+        <w:sz w:val="20"/>
+      </w:rPr>
+    </w:lvl>
+    <w:lvl w:ilvl="1" w:tentative="1">
+      <w:start w:val="1"/>
+      <w:numFmt w:val="bullet"/>
+      <w:lvlText w:val="o"/>
+      <w:lvlJc w:val="left"/>
+      <w:pPr>
+        <w:tabs>
+          <w:tab w:val="num" w:pos="1440"/>
+        </w:tabs>
+        <w:ind w:left="1440" w:hanging="360"/>
+      </w:pPr>
+      <w:rPr>
+        <w:rFonts w:ascii="Courier New" w:hAnsi="Courier New" w:hint="default"/>
+        <w:sz w:val="20"/>
+      </w:rPr>
+    </w:lvl>
+    <w:lvl w:ilvl="2" w:tentative="1">
+      <w:start w:val="1"/>
+      <w:numFmt w:val="bullet"/>
+      <w:lvlText w:val=""/>
+      <w:lvlJc w:val="left"/>
+      <w:pPr>
+        <w:tabs>
+          <w:tab w:val="num" w:pos="2160"/>
+        </w:tabs>
+        <w:ind w:left="2160" w:hanging="360"/>
+      </w:pPr>
+      <w:rPr>
+        <w:rFonts w:ascii="Wingdings" w:hAnsi="Wingdings" w:hint="default"/>
+        <w:sz w:val="20"/>
+      </w:rPr>
+    </w:lvl>
+    <w:lvl w:ilvl="3" w:tentative="1">
+      <w:start w:val="1"/>
+      <w:numFmt w:val="bullet"/>
+      <w:lvlText w:val=""/>
+      <w:lvlJc w:val="left"/>
+      <w:pPr>
+        <w:tabs>
+          <w:tab w:val="num" w:pos="2880"/>
+        </w:tabs>
+        <w:ind w:left="2880" w:hanging="360"/>
+      </w:pPr>
+      <w:rPr>
+        <w:rFonts w:ascii="Wingdings" w:hAnsi="Wingdings" w:hint="default"/>
+        <w:sz w:val="20"/>
+      </w:rPr>
+    </w:lvl>
+    <w:lvl w:ilvl="4" w:tentative="1">
+      <w:start w:val="1"/>
+      <w:numFmt w:val="bullet"/>
+      <w:lvlText w:val=""/>
+      <w:lvlJc w:val="left"/>
+      <w:pPr>
+        <w:tabs>
+          <w:tab w:val="num" w:pos="3600"/>
+        </w:tabs>
+        <w:ind w:left="3600" w:hanging="360"/>
+      </w:pPr>
+      <w:rPr>
+        <w:rFonts w:ascii="Wingdings" w:hAnsi="Wingdings" w:hint="default"/>
+        <w:sz w:val="20"/>
+      </w:rPr>
+    </w:lvl>
+    <w:lvl w:ilvl="5" w:tentative="1">
+      <w:start w:val="1"/>
+      <w:numFmt w:val="bullet"/>
+      <w:lvlText w:val=""/>
+      <w:lvlJc w:val="left"/>
+      <w:pPr>
+        <w:tabs>
+          <w:tab w:val="num" w:pos="4320"/>
+        </w:tabs>
+        <w:ind w:left="4320" w:hanging="360"/>
+      </w:pPr>
+      <w:rPr>
+        <w:rFonts w:ascii="Wingdings" w:hAnsi="Wingdings" w:hint="default"/>
+        <w:sz w:val="20"/>
+      </w:rPr>
+    </w:lvl>
+    <w:lvl w:ilvl="6" w:tentative="1">
+      <w:start w:val="1"/>
+      <w:numFmt w:val="bullet"/>
+      <w:lvlText w:val=""/>
+      <w:lvlJc w:val="left"/>
+      <w:pPr>
+        <w:tabs>
+          <w:tab w:val="num" w:pos="5040"/>
+        </w:tabs>
+        <w:ind w:left="5040" w:hanging="360"/>
+      </w:pPr>
+      <w:rPr>
+        <w:rFonts w:ascii="Wingdings" w:hAnsi="Wingdings" w:hint="default"/>
+        <w:sz w:val="20"/>
+      </w:rPr>
+    </w:lvl>
+    <w:lvl w:ilvl="7" w:tentative="1">
+      <w:start w:val="1"/>
+      <w:numFmt w:val="bullet"/>
+      <w:lvlText w:val=""/>
+      <w:lvlJc w:val="left"/>
+      <w:pPr>
+        <w:tabs>
+          <w:tab w:val="num" w:pos="5760"/>
+        </w:tabs>
+        <w:ind w:left="5760" w:hanging="360"/>
+      </w:pPr>
+      <w:rPr>
+        <w:rFonts w:ascii="Wingdings" w:hAnsi="Wingdings" w:hint="default"/>
+        <w:sz w:val="20"/>
+      </w:rPr>
+    </w:lvl>
+    <w:lvl w:ilvl="8" w:tentative="1">
+      <w:start w:val="1"/>
+      <w:numFmt w:val="bullet"/>
+      <w:lvlText w:val=""/>
+      <w:lvlJc w:val="left"/>
+      <w:pPr>
+        <w:tabs>
+          <w:tab w:val="num" w:pos="6480"/>
+        </w:tabs>
+        <w:ind w:left="6480" w:hanging="360"/>
+      </w:pPr>
+      <w:rPr>
+        <w:rFonts w:ascii="Wingdings" w:hAnsi="Wingdings" w:hint="default"/>
+        <w:sz w:val="20"/>
+      </w:rPr>
+    </w:lvl>
+  </w:abstractNum>
+  <w:abstractNum w:abstractNumId="12" w15:restartNumberingAfterBreak="0">
     <w:nsid w:val="764F7DF3"/>
     <w:multiLevelType w:val="multilevel"/>
     <w:tmpl w:val="65A00C30"/>
@@ -8566,7 +10445,7 @@
       </w:pPr>
     </w:lvl>
   </w:abstractNum>
-  <w:abstractNum w:abstractNumId="8" w15:restartNumberingAfterBreak="0">
+  <w:abstractNum w:abstractNumId="13" w15:restartNumberingAfterBreak="0">
     <w:nsid w:val="7F3A27A5"/>
     <w:multiLevelType w:val="multilevel"/>
     <w:tmpl w:val="4B1CF596"/>
@@ -8684,31 +10563,46 @@
     </w:lvl>
   </w:abstractNum>
   <w:num w:numId="1" w16cid:durableId="262684813">
+    <w:abstractNumId w:val="13"/>
+  </w:num>
+  <w:num w:numId="2" w16cid:durableId="156305667">
+    <w:abstractNumId w:val="2"/>
+  </w:num>
+  <w:num w:numId="3" w16cid:durableId="424227804">
     <w:abstractNumId w:val="8"/>
   </w:num>
-  <w:num w:numId="2" w16cid:durableId="156305667">
+  <w:num w:numId="4" w16cid:durableId="1106191958">
+    <w:abstractNumId w:val="4"/>
+  </w:num>
+  <w:num w:numId="5" w16cid:durableId="284820410">
+    <w:abstractNumId w:val="5"/>
+  </w:num>
+  <w:num w:numId="6" w16cid:durableId="20713170">
     <w:abstractNumId w:val="1"/>
   </w:num>
-  <w:num w:numId="3" w16cid:durableId="424227804">
-    <w:abstractNumId w:val="5"/>
+  <w:num w:numId="7" w16cid:durableId="1657882331">
+    <w:abstractNumId w:val="7"/>
   </w:num>
-  <w:num w:numId="4" w16cid:durableId="1106191958">
-    <w:abstractNumId w:val="2"/>
+  <w:num w:numId="8" w16cid:durableId="2100322913">
+    <w:abstractNumId w:val="9"/>
   </w:num>
-  <w:num w:numId="5" w16cid:durableId="284820410">
+  <w:num w:numId="9" w16cid:durableId="134300193">
+    <w:abstractNumId w:val="12"/>
+  </w:num>
+  <w:num w:numId="10" w16cid:durableId="1213037260">
+    <w:abstractNumId w:val="10"/>
+  </w:num>
+  <w:num w:numId="11" w16cid:durableId="1677919359">
+    <w:abstractNumId w:val="11"/>
+  </w:num>
+  <w:num w:numId="12" w16cid:durableId="2020737257">
     <w:abstractNumId w:val="3"/>
   </w:num>
-  <w:num w:numId="6" w16cid:durableId="20713170">
+  <w:num w:numId="13" w16cid:durableId="1128741993">
     <w:abstractNumId w:val="0"/>
   </w:num>
-  <w:num w:numId="7" w16cid:durableId="1657882331">
-    <w:abstractNumId w:val="4"/>
-  </w:num>
-  <w:num w:numId="8" w16cid:durableId="2100322913">
+  <w:num w:numId="14" w16cid:durableId="233513244">
     <w:abstractNumId w:val="6"/>
-  </w:num>
-  <w:num w:numId="9" w16cid:durableId="134300193">
-    <w:abstractNumId w:val="7"/>
   </w:num>
 </w:numbering>
 </file>
@@ -9629,6 +11523,29 @@
       <w:spacing w:val="5"/>
     </w:rPr>
   </w:style>
+  <w:style w:type="character" w:styleId="Hipervnculo">
+    <w:name w:val="Hyperlink"/>
+    <w:basedOn w:val="Fuentedeprrafopredeter"/>
+    <w:uiPriority w:val="99"/>
+    <w:unhideWhenUsed/>
+    <w:rsid w:val="00C1366A"/>
+    <w:rPr>
+      <w:color w:val="0563C1" w:themeColor="hyperlink"/>
+      <w:u w:val="single"/>
+    </w:rPr>
+  </w:style>
+  <w:style w:type="character" w:styleId="Mencinsinresolver">
+    <w:name w:val="Unresolved Mention"/>
+    <w:basedOn w:val="Fuentedeprrafopredeter"/>
+    <w:uiPriority w:val="99"/>
+    <w:semiHidden/>
+    <w:unhideWhenUsed/>
+    <w:rsid w:val="00C1366A"/>
+    <w:rPr>
+      <w:color w:val="605E5C"/>
+      <w:shd w:val="clear" w:color="auto" w:fill="E1DFDD"/>
+    </w:rPr>
+  </w:style>
 </w:styles>
 </file>
 

</xml_diff>